<commit_message>
Balance enemy pressure in levels 8 through 10
</commit_message>
<xml_diff>
--- a/Documents/Chomp_TODO_Roadmap_Updated.docx
+++ b/Documents/Chomp_TODO_Roadmap_Updated.docx
@@ -30,23 +30,9 @@
     </w:p>
     <w:p>
       <w:r>
-        <w:rPr>
-          <w:b/>
-        </w:rPr>
-        <w:t xml:space="preserve">Project: </w:t>
-      </w:r>
-      <w:r>
-        <w:t>Chomp - A Shark Maze Arcade Game</w:t>
-      </w:r>
-      <w:r>
-        <w:rPr>
-          <w:b/>
-        </w:rPr>
+        <w:t>Project: Chomp - A Shark Maze Arcade Game</w:t>
         <w:br/>
-        <w:t xml:space="preserve">Current build status: </w:t>
-      </w:r>
-      <w:r>
-        <w:t>Playable browser-based HTML Canvas game with core arcade systems, responsive layout, visual polish, audio, and active Phase A polish work.</w:t>
+        <w:t>Current build status: Playable browser-based HTML Canvas game with Golden Fish, Puffer Guard, 10 configured levels, responsive layout, visual polish, audio, and a completed source-level balance pass for Levels 4-10. Remaining work is final hands-on browser/mobile QA and release polish.</w:t>
       </w:r>
     </w:p>
     <w:p>
@@ -230,12 +216,8 @@
             <w:pPr>
               <w:spacing w:after="0"/>
             </w:pPr>
-            <w:r/>
             <w:r>
-              <w:rPr>
-                <w:b w:val="0"/>
-              </w:rPr>
-              <w:t>Enemies, lives, game over/restart, Frenzy Mode, level clear, 3-level win condition.</w:t>
+              <w:t>Enemies, lives, game over/restart, Frenzy Mode, level clear, and 10-level win condition.</w:t>
             </w:r>
           </w:p>
         </w:tc>
@@ -268,12 +250,8 @@
             <w:pPr>
               <w:spacing w:after="0"/>
             </w:pPr>
-            <w:r/>
             <w:r>
-              <w:rPr>
-                <w:b w:val="0"/>
-              </w:rPr>
-              <w:t>Done for v1</w:t>
+              <w:t>Done for current v1 scope</w:t>
             </w:r>
           </w:p>
         </w:tc>
@@ -286,12 +264,8 @@
             <w:pPr>
               <w:spacing w:after="0"/>
             </w:pPr>
-            <w:r/>
             <w:r>
-              <w:rPr>
-                <w:b w:val="0"/>
-              </w:rPr>
-              <w:t>Three playable maze layouts with progression, difficulty scaling, debug mode.</w:t>
+              <w:t>Ten playable maze layouts with progression, difficulty scaling, debug mode, validation, and recent Levels 4-10 balance pass.</w:t>
             </w:r>
           </w:p>
         </w:tc>
@@ -324,12 +298,8 @@
             <w:pPr>
               <w:spacing w:after="0"/>
             </w:pPr>
-            <w:r/>
             <w:r>
-              <w:rPr>
-                <w:b w:val="0"/>
-              </w:rPr>
-              <w:t>Mostly done</w:t>
+              <w:t>Done as base</w:t>
             </w:r>
           </w:p>
         </w:tc>
@@ -342,12 +312,8 @@
             <w:pPr>
               <w:spacing w:after="0"/>
             </w:pPr>
-            <w:r/>
             <w:r>
-              <w:rPr>
-                <w:b w:val="0"/>
-              </w:rPr>
-              <w:t>HUD, pause, high score, mute/sound, responsive desktop/mobile layout.</w:t>
+              <w:t>HUD, pause, high score, mute/sound, responsive desktop/mobile layout; pending final device QA.</w:t>
             </w:r>
           </w:p>
         </w:tc>
@@ -380,12 +346,8 @@
             <w:pPr>
               <w:spacing w:after="0"/>
             </w:pPr>
-            <w:r/>
             <w:r>
-              <w:rPr>
-                <w:b w:val="0"/>
-              </w:rPr>
-              <w:t>In progress</w:t>
+              <w:t>Done as base</w:t>
             </w:r>
           </w:p>
         </w:tc>
@@ -398,12 +360,8 @@
             <w:pPr>
               <w:spacing w:after="0"/>
             </w:pPr>
-            <w:r/>
             <w:r>
-              <w:rPr>
-                <w:b w:val="0"/>
-              </w:rPr>
-              <w:t>Environment, shark art/chomp, enemy visuals, particles, bubbles, overlays, Frenzy readability.</w:t>
+              <w:t>Environment, chunky shark art/chomp, enemy visuals, particles, bubbles, overlays, and Frenzy readability; pending final browser/device review.</w:t>
             </w:r>
           </w:p>
         </w:tc>
@@ -492,12 +450,8 @@
             <w:pPr>
               <w:spacing w:after="0"/>
             </w:pPr>
-            <w:r/>
             <w:r>
-              <w:rPr>
-                <w:b w:val="0"/>
-              </w:rPr>
-              <w:t>Not started</w:t>
+              <w:t>Mostly complete for v1</w:t>
             </w:r>
           </w:p>
         </w:tc>
@@ -510,12 +464,8 @@
             <w:pPr>
               <w:spacing w:after="0"/>
             </w:pPr>
-            <w:r/>
             <w:r>
-              <w:rPr>
-                <w:b w:val="0"/>
-              </w:rPr>
-              <w:t>Golden Fish, Puffer Guard, 10 levels, mobile final pass, portfolio README.</w:t>
+              <w:t>Golden Fish, Puffer Guard, and 10 levels are implemented. Remaining work: manual browser/mobile QA, screenshots, portfolio README, and release tag.</w:t>
             </w:r>
           </w:p>
         </w:tc>
@@ -718,13 +668,7 @@
         <w:pStyle w:val="ListBullet"/>
       </w:pPr>
       <w:r>
-        <w:rPr>
-          <w:b/>
-        </w:rPr>
-        <w:t xml:space="preserve">[x] </w:t>
-      </w:r>
-      <w:r>
-        <w:t>Added level clear, level progression, three maze layouts, and win condition.</w:t>
+        <w:t>[x] Added level clear, level progression, configured maze layouts, and win condition.</w:t>
       </w:r>
     </w:p>
     <w:p>
@@ -894,13 +838,7 @@
         <w:pStyle w:val="ListBullet"/>
       </w:pPr>
       <w:r>
-        <w:rPr>
-          <w:b/>
-        </w:rPr>
-        <w:t xml:space="preserve">[x] </w:t>
-      </w:r>
-      <w:r>
-        <w:t>Added/queued screen overlay polish and Frenzy Mode readability/balance polish.</w:t>
+        <w:t>[x] Added screen overlay polish, Frenzy Mode readability/balance polish, Golden Fish, Puffer Guard, and 10-level progression.</w:t>
       </w:r>
     </w:p>
     <w:p>
@@ -994,13 +932,7 @@
         <w:pStyle w:val="ListBullet"/>
       </w:pPr>
       <w:r>
-        <w:rPr>
-          <w:b/>
-        </w:rPr>
-        <w:t xml:space="preserve">[ ] </w:t>
-      </w:r>
-      <w:r>
-        <w:t>Test all Phase A changes together on desktop and phone after the latest merge.</w:t>
+        <w:t>[ ] Test all polish, level, Golden Fish, and Puffer changes together on desktop and phone after the latest merge.</w:t>
       </w:r>
     </w:p>
     <w:p>
@@ -1008,13 +940,7 @@
         <w:pStyle w:val="ListBullet"/>
       </w:pPr>
       <w:r>
-        <w:rPr>
-          <w:b/>
-        </w:rPr>
-        <w:t xml:space="preserve">[ ] </w:t>
-      </w:r>
-      <w:r>
-        <w:t>Make a final readability pass: shark/enemy clarity, Frenzy clarity, particle density, HUD scaling.</w:t>
+        <w:t>[x] Make a source-level readability and balance pass: shark/enemy clarity, Frenzy clarity, particle density, HUD scaling, and Levels 4-10 pressure.</w:t>
       </w:r>
     </w:p>
     <w:p>
@@ -1022,13 +948,7 @@
         <w:pStyle w:val="ListBullet"/>
       </w:pPr>
       <w:r>
-        <w:rPr>
-          <w:b/>
-        </w:rPr>
-        <w:t xml:space="preserve">[ ] </w:t>
-      </w:r>
-      <w:r>
-        <w:t>Confirm no console errors, no audio errors, and no performance issues.</w:t>
+        <w:t>[ ] Confirm no console errors, no audio errors, and no performance issues in real browser/device testing.</w:t>
       </w:r>
     </w:p>
     <w:p>
@@ -1036,7 +956,7 @@
         <w:pStyle w:val="Heading1"/>
       </w:pPr>
       <w:r>
-        <w:t>4. Remaining Roadmap</w:t>
+        <w:t>4. Roadmap Status</w:t>
       </w:r>
     </w:p>
     <w:p>
@@ -1052,13 +972,7 @@
         <w:pStyle w:val="ListBullet"/>
       </w:pPr>
       <w:r>
-        <w:rPr>
-          <w:b/>
-        </w:rPr>
-        <w:t xml:space="preserve">[ ] </w:t>
-      </w:r>
-      <w:r>
-        <w:t>Add Golden Fish bonus item that appears temporarily and is not required for level clear.</w:t>
+        <w:t>[x] Add Golden Fish bonus item that appears temporarily and is not required for level clear.</w:t>
       </w:r>
     </w:p>
     <w:p>
@@ -1066,13 +980,7 @@
         <w:pStyle w:val="ListBullet"/>
       </w:pPr>
       <w:r>
-        <w:rPr>
-          <w:b/>
-        </w:rPr>
-        <w:t xml:space="preserve">[ ] </w:t>
-      </w:r>
-      <w:r>
-        <w:t>Award bonus points, possibly scaling by level.</w:t>
+        <w:t>[x] Award Golden Fish bonus points with level-tunable appearance settings.</w:t>
       </w:r>
     </w:p>
     <w:p>
@@ -1080,13 +988,7 @@
         <w:pStyle w:val="ListBullet"/>
       </w:pPr>
       <w:r>
-        <w:rPr>
-          <w:b/>
-        </w:rPr>
-        <w:t xml:space="preserve">[ ] </w:t>
-      </w:r>
-      <w:r>
-        <w:t>Add clear visual shimmer/glow and collection sound/effect.</w:t>
+        <w:t>[x] Add clear visual shimmer/glow and collection sound/effect.</w:t>
       </w:r>
     </w:p>
     <w:p>
@@ -1094,13 +996,7 @@
         <w:pStyle w:val="ListBullet"/>
       </w:pPr>
       <w:r>
-        <w:rPr>
-          <w:b/>
-        </w:rPr>
-        <w:t xml:space="preserve">[ ] </w:t>
-      </w:r>
-      <w:r>
-        <w:t>Ensure it creates risk/reward without disrupting maze flow.</w:t>
+        <w:t>[x] Ensure it creates risk/reward without disrupting maze flow.</w:t>
       </w:r>
     </w:p>
     <w:p>
@@ -1116,13 +1012,7 @@
         <w:pStyle w:val="ListBullet"/>
       </w:pPr>
       <w:r>
-        <w:rPr>
-          <w:b/>
-        </w:rPr>
-        <w:t xml:space="preserve">[ ] </w:t>
-      </w:r>
-      <w:r>
-        <w:t>Add Puffer Guard as a slow route-blocking enemy for later levels.</w:t>
+        <w:t>[x] Add Puffer Guard as a slow route-pressure enemy for later levels.</w:t>
       </w:r>
     </w:p>
     <w:p>
@@ -1130,13 +1020,7 @@
         <w:pStyle w:val="ListBullet"/>
       </w:pPr>
       <w:r>
-        <w:rPr>
-          <w:b/>
-        </w:rPr>
-        <w:t xml:space="preserve">[ ] </w:t>
-      </w:r>
-      <w:r>
-        <w:t>Give it a distinct pufferfish look with slow patrol behavior.</w:t>
+        <w:t>[x] Give it a distinct pufferfish look with slow patrol behavior.</w:t>
       </w:r>
     </w:p>
     <w:p>
@@ -1144,13 +1028,7 @@
         <w:pStyle w:val="ListBullet"/>
       </w:pPr>
       <w:r>
-        <w:rPr>
-          <w:b/>
-        </w:rPr>
-        <w:t xml:space="preserve">[ ] </w:t>
-      </w:r>
-      <w:r>
-        <w:t>Integrate with Frenzy Mode vulnerability and enemy collision system.</w:t>
+        <w:t>[x] Integrate with Frenzy Mode vulnerability and enemy collision system.</w:t>
       </w:r>
     </w:p>
     <w:p>
@@ -1158,13 +1036,7 @@
         <w:pStyle w:val="ListBullet"/>
       </w:pPr>
       <w:r>
-        <w:rPr>
-          <w:b/>
-        </w:rPr>
-        <w:t xml:space="preserve">[ ] </w:t>
-      </w:r>
-      <w:r>
-        <w:t>Introduce only in later levels so early difficulty remains fair.</w:t>
+        <w:t>[x] Introduce through level data so early difficulty remains fair.</w:t>
       </w:r>
     </w:p>
     <w:p>
@@ -1180,13 +1052,7 @@
         <w:pStyle w:val="ListBullet"/>
       </w:pPr>
       <w:r>
-        <w:rPr>
-          <w:b/>
-        </w:rPr>
-        <w:t xml:space="preserve">[ ] </w:t>
-      </w:r>
-      <w:r>
-        <w:t>Add more maze layouts or variations, expanding from 3 levels to 10.</w:t>
+        <w:t>[x] Add more maze layouts or variations, expanding from 3 levels to 10.</w:t>
       </w:r>
     </w:p>
     <w:p>
@@ -1194,13 +1060,7 @@
         <w:pStyle w:val="ListBullet"/>
       </w:pPr>
       <w:r>
-        <w:rPr>
-          <w:b/>
-        </w:rPr>
-        <w:t xml:space="preserve">[ ] </w:t>
-      </w:r>
-      <w:r>
-        <w:t>Improve difficulty scaling across levels: speed, enemy count, Frenzy duration, maze complexity.</w:t>
+        <w:t>[x] Improve difficulty scaling across levels: speed, enemy count, Frenzy duration, maze complexity, and Levels 4-10 balance.</w:t>
       </w:r>
     </w:p>
     <w:p>
@@ -1208,13 +1068,7 @@
         <w:pStyle w:val="ListBullet"/>
       </w:pPr>
       <w:r>
-        <w:rPr>
-          <w:b/>
-        </w:rPr>
-        <w:t xml:space="preserve">[ ] </w:t>
-      </w:r>
-      <w:r>
-        <w:t>Make sure every level has reachable chum and valid spawns.</w:t>
+        <w:t>[x] Make sure every level has reachable chum/Frenzy Bait and valid spawns.</w:t>
       </w:r>
     </w:p>
     <w:p>
@@ -1222,13 +1076,7 @@
         <w:pStyle w:val="ListBullet"/>
       </w:pPr>
       <w:r>
-        <w:rPr>
-          <w:b/>
-        </w:rPr>
-        <w:t xml:space="preserve">[ ] </w:t>
-      </w:r>
-      <w:r>
-        <w:t>Update win condition to trigger after level 10.</w:t>
+        <w:t>[x] Update win condition to trigger after level 10.</w:t>
       </w:r>
     </w:p>
     <w:p>
@@ -1404,7 +1252,7 @@
         <w:pStyle w:val="ListBullet"/>
       </w:pPr>
       <w:r>
-        <w:t>Enemies currently include Dolphin Patrol, Electric Eel, and Diver Drone, each with distinct visual/behavior goals.</w:t>
+        <w:t>Enemies currently include Dolphin Patrol, Electric Eel, Diver Drone, and Puffer Guard, each with distinct visual/behavior goals.</w:t>
       </w:r>
     </w:p>
     <w:p>
@@ -1412,7 +1260,7 @@
         <w:pStyle w:val="ListBullet"/>
       </w:pPr>
       <w:r>
-        <w:t>Lives, game over, restart, pause/resume, high score, debug mode, audio mute, and responsive canvas must keep working.</w:t>
+        <w:t>Golden Fish, lives, game over, restart, pause/resume, high score, debug mode, audio mute, and responsive canvas must keep working.</w:t>
       </w:r>
     </w:p>
     <w:p>
@@ -1451,306 +1299,49 @@
         <w:shd w:fill="EAF8FB"/>
       </w:pPr>
       <w:r>
-        <w:rPr>
-          <w:rFonts w:ascii="Courier New" w:hAnsi="Courier New"/>
-          <w:sz w:val="17"/>
-        </w:rPr>
-        <w:t>I am continuing development on a browser-based HTML Canvas game called CHOMP: A Shark Maze Arcade Game. It is a retro reef arcade maze game where a cartoon shark collects chum, avoids enemies, and uses Frenzy Bait to enter Frenzy Mode and chomp vulnerable enemies.</w:t>
-      </w:r>
-      <w:r>
+        <w:t>I am continuing development on a browser-based HTML Canvas game called CHOMP: A Shark Maze Arcade Game. It is a retro reef arcade maze game where a chunky cartoon shark collects chum, avoids enemies, grabs Golden Fish bonuses, and uses Frenzy Bait to enter Frenzy Mode and chomp vulnerable enemies.</w:t>
         <w:br/>
-      </w:r>
-      <w:r>
-        <w:rPr>
-          <w:rFonts w:ascii="Courier New" w:hAnsi="Courier New"/>
-          <w:sz w:val="17"/>
-        </w:rPr>
-      </w:r>
-      <w:r>
         <w:br/>
-      </w:r>
-      <w:r>
-        <w:rPr>
-          <w:rFonts w:ascii="Courier New" w:hAnsi="Courier New"/>
-          <w:sz w:val="17"/>
-        </w:rPr>
         <w:t>Current implemented features:</w:t>
-      </w:r>
-      <w:r>
         <w:br/>
-      </w:r>
-      <w:r>
-        <w:rPr>
-          <w:rFonts w:ascii="Courier New" w:hAnsi="Courier New"/>
-          <w:sz w:val="17"/>
-        </w:rPr>
-        <w:t>- HTML/CSS/JavaScript Canvas project published/planned for GitHub Pages.</w:t>
-      </w:r>
-      <w:r>
+        <w:t>- HTML/CSS/JavaScript Canvas project suitable for GitHub Pages.</w:t>
         <w:br/>
-      </w:r>
-      <w:r>
-        <w:rPr>
-          <w:rFonts w:ascii="Courier New" w:hAnsi="Courier New"/>
-          <w:sz w:val="17"/>
-        </w:rPr>
-        <w:t>- Tile-based maze system with coral reef walls, water paths, chum, and Frenzy Bait.</w:t>
-      </w:r>
-      <w:r>
+        <w:t>- Tile-based maze system with coral reef walls, water paths, chum, Frenzy Bait, and Golden Fish.</w:t>
         <w:br/>
-      </w:r>
-      <w:r>
-        <w:rPr>
-          <w:rFonts w:ascii="Courier New" w:hAnsi="Courier New"/>
-          <w:sz w:val="17"/>
-        </w:rPr>
-        <w:t>- Shark player movement with Arrow Keys/WASD and mobile swipe, wall collision, and responsive canvas.</w:t>
-      </w:r>
-      <w:r>
+        <w:t>- Shark player movement with Arrow Keys/WASD and mobile swipe, wall collision, responsive canvas, Pac-Man-style chomp, angry eye, direction rotation, and Frenzy appearance.</w:t>
         <w:br/>
-      </w:r>
-      <w:r>
-        <w:rPr>
-          <w:rFonts w:ascii="Courier New" w:hAnsi="Courier New"/>
-          <w:sz w:val="17"/>
-        </w:rPr>
         <w:t>- Score, chum-left counter, lives, game over, restart, pause/resume, localStorage high score, debug mode, and mute/sound button.</w:t>
-      </w:r>
-      <w:r>
         <w:br/>
-      </w:r>
-      <w:r>
-        <w:rPr>
-          <w:rFonts w:ascii="Courier New" w:hAnsi="Courier New"/>
-          <w:sz w:val="17"/>
-        </w:rPr>
-        <w:t>- Enemies: Dolphin Patrol, Electric Eel, and Diver Drone with multiple-enemy system.</w:t>
-      </w:r>
-      <w:r>
+        <w:t>- Enemies: Dolphin Patrol, Electric Eel, Diver Drone, and Puffer Guard with multiple-enemy level data.</w:t>
         <w:br/>
-      </w:r>
-      <w:r>
-        <w:rPr>
-          <w:rFonts w:ascii="Courier New" w:hAnsi="Courier New"/>
-          <w:sz w:val="17"/>
-        </w:rPr>
         <w:t>- Frenzy Mode: triggered by Frenzy Bait, makes enemies vulnerable, shark can chomp enemies for bonus points, timer/display/visual effects.</w:t>
-      </w:r>
-      <w:r>
         <w:br/>
-      </w:r>
-      <w:r>
-        <w:rPr>
-          <w:rFonts w:ascii="Courier New" w:hAnsi="Courier New"/>
-          <w:sz w:val="17"/>
-        </w:rPr>
-        <w:t>- Level clear/progression with 3 maze layouts and win condition.</w:t>
-      </w:r>
-      <w:r>
+        <w:t>- Level clear/progression with 10 configured maze layouts and win condition after Level 10.</w:t>
         <w:br/>
-      </w:r>
-      <w:r>
-        <w:rPr>
-          <w:rFonts w:ascii="Courier New" w:hAnsi="Courier New"/>
-          <w:sz w:val="17"/>
-        </w:rPr>
-        <w:t>- Visual polish: underwater page/HUD, reef maze styling, shark chomping animation with teeth, flatter shark belly, two-lobed shark tail, improved dorsal fin, creature motion polish, bubbles/particles, random shark-pun level-clear messages.</w:t>
-      </w:r>
-      <w:r>
+        <w:t>- Visual polish: underwater page/HUD, reef maze styling, chunky shark art/chomp, creature motion polish, bubbles/particles, random shark-pun level-clear messages.</w:t>
         <w:br/>
-      </w:r>
-      <w:r>
-        <w:rPr>
-          <w:rFonts w:ascii="Courier New" w:hAnsi="Courier New"/>
-          <w:sz w:val="17"/>
-        </w:rPr>
         <w:t>- Audio polish: generated arcade sound effects using Web Audio API, mute saved with localStorage, subtle reverb/echo.</w:t>
-      </w:r>
-      <w:r>
         <w:br/>
-      </w:r>
-      <w:r>
-        <w:rPr>
-          <w:rFonts w:ascii="Courier New" w:hAnsi="Courier New"/>
-          <w:sz w:val="17"/>
-        </w:rPr>
-      </w:r>
-      <w:r>
+        <w:t>- Latest balance pass: Levels 4-10 inspected for reachability, spawn validity, Puffer route blocking, escape routes, enemy pressure, and difficulty progression. Levels 8-10 had enemy speed modifiers reduced so challenge comes from roster density and maze decisions rather than overcrowding at max speed.</w:t>
         <w:br/>
-      </w:r>
-      <w:r>
-        <w:rPr>
-          <w:rFonts w:ascii="Courier New" w:hAnsi="Courier New"/>
-          <w:sz w:val="17"/>
-        </w:rPr>
-        <w:t>Recent Phase A polish tasks:</w:t>
-      </w:r>
-      <w:r>
         <w:br/>
-      </w:r>
-      <w:r>
-        <w:rPr>
-          <w:rFonts w:ascii="Courier New" w:hAnsi="Courier New"/>
-          <w:sz w:val="17"/>
-        </w:rPr>
-        <w:t>- Slightly increased shark speed.</w:t>
-      </w:r>
-      <w:r>
+        <w:t>Do not break existing gameplay. Keep code beginner-friendly, Canvas-only, no external libraries, preserve mobile support, GitHub Pages compatibility, debug mode, audio mute, high score, Golden Fish, Puffer Guard, level progression, and LICENSE. Do not redesign the approved chunky shark unless explicitly requested.</w:t>
         <w:br/>
-      </w:r>
-      <w:r>
-        <w:rPr>
-          <w:rFonts w:ascii="Courier New" w:hAnsi="Courier New"/>
-          <w:sz w:val="17"/>
-        </w:rPr>
-        <w:t>- Improved shark chomp so upper jaw/nose moves with the mouth instead of only the lower mouth opening.</w:t>
-      </w:r>
-      <w:r>
         <w:br/>
-      </w:r>
-      <w:r>
-        <w:rPr>
-          <w:rFonts w:ascii="Courier New" w:hAnsi="Courier New"/>
-          <w:sz w:val="17"/>
-        </w:rPr>
-        <w:t>- Improved creature motion: eel electricity should animate, eel body should slither, dolphin should have a clearer dolphin nose/beak and subtle tail/fin movement, shark tail should animate subtly.</w:t>
-      </w:r>
-      <w:r>
+        <w:t>Next likely roadmap phases:</w:t>
         <w:br/>
-      </w:r>
-      <w:r>
-        <w:rPr>
-          <w:rFonts w:ascii="Courier New" w:hAnsi="Courier New"/>
-          <w:sz w:val="17"/>
-        </w:rPr>
-        <w:t>- Improved overlay screens: start, pause, level clear, game over, win.</w:t>
-      </w:r>
-      <w:r>
+        <w:t>1. Run full manual browser playtesting on desktop for Levels 1-10, with extra attention to Levels 4-10 and the Level 10 win flow.</w:t>
         <w:br/>
-      </w:r>
-      <w:r>
-        <w:rPr>
-          <w:rFonts w:ascii="Courier New" w:hAnsi="Courier New"/>
-          <w:sz w:val="17"/>
-        </w:rPr>
-        <w:t>- Improved Frenzy Mode readability: clear FRENZY start/end feedback, better vulnerable enemy visuals, clearer timer/warning.</w:t>
-      </w:r>
-      <w:r>
+        <w:t>2. Run mobile/iPhone Safari testing from the GitHub Pages link: tap start/restart, swipe movement, pause, mute, audio unlock, scaling, and no unwanted scrolling.</w:t>
         <w:br/>
-      </w:r>
-      <w:r>
-        <w:rPr>
-          <w:rFonts w:ascii="Courier New" w:hAnsi="Courier New"/>
-          <w:sz w:val="17"/>
-        </w:rPr>
-      </w:r>
-      <w:r>
+        <w:t>3. Capture final screenshots or GIFs if desired for portfolio presentation.</w:t>
         <w:br/>
-      </w:r>
-      <w:r>
-        <w:rPr>
-          <w:rFonts w:ascii="Courier New" w:hAnsi="Courier New"/>
-          <w:sz w:val="17"/>
-        </w:rPr>
-        <w:t>Do not break existing gameplay. Keep code beginner-friendly, Canvas-only, no external libraries, preserve mobile support, GitHub Pages compatibility, debug mode, audio mute, high score, and LICENSE.</w:t>
-      </w:r>
-      <w:r>
+        <w:t>4. Finalize README/release polish and tag a stable v1.0 milestone when ready.</w:t>
         <w:br/>
-      </w:r>
-      <w:r>
-        <w:rPr>
-          <w:rFonts w:ascii="Courier New" w:hAnsi="Courier New"/>
-          <w:sz w:val="17"/>
-        </w:rPr>
-      </w:r>
-      <w:r>
+        <w:t>5. Later, consider post-v1 expansion toward additional levels only after the 10-level build is fully validated.</w:t>
         <w:br/>
-      </w:r>
-      <w:r>
-        <w:rPr>
-          <w:rFonts w:ascii="Courier New" w:hAnsi="Courier New"/>
-          <w:sz w:val="17"/>
-        </w:rPr>
-        <w:t>Next likely roadmap phases:</w:t>
-      </w:r>
-      <w:r>
         <w:br/>
-      </w:r>
-      <w:r>
-        <w:rPr>
-          <w:rFonts w:ascii="Courier New" w:hAnsi="Courier New"/>
-          <w:sz w:val="17"/>
-        </w:rPr>
-        <w:t>1. Finish Phase A final testing/readability/performance pass.</w:t>
-      </w:r>
-      <w:r>
-        <w:br/>
-      </w:r>
-      <w:r>
-        <w:rPr>
-          <w:rFonts w:ascii="Courier New" w:hAnsi="Courier New"/>
-          <w:sz w:val="17"/>
-        </w:rPr>
-        <w:t>2. Add Golden Fish bonus item.</w:t>
-      </w:r>
-      <w:r>
-        <w:br/>
-      </w:r>
-      <w:r>
-        <w:rPr>
-          <w:rFonts w:ascii="Courier New" w:hAnsi="Courier New"/>
-          <w:sz w:val="17"/>
-        </w:rPr>
-        <w:t>3. Add Puffer Guard enemy.</w:t>
-      </w:r>
-      <w:r>
-        <w:br/>
-      </w:r>
-      <w:r>
-        <w:rPr>
-          <w:rFonts w:ascii="Courier New" w:hAnsi="Courier New"/>
-          <w:sz w:val="17"/>
-        </w:rPr>
-        <w:t>4. Expand from 3 levels to 10 levels.</w:t>
-      </w:r>
-      <w:r>
-        <w:br/>
-      </w:r>
-      <w:r>
-        <w:rPr>
-          <w:rFonts w:ascii="Courier New" w:hAnsi="Courier New"/>
-          <w:sz w:val="17"/>
-        </w:rPr>
-        <w:t>5. Final mobile/GitHub Pages testing.</w:t>
-      </w:r>
-      <w:r>
-        <w:br/>
-      </w:r>
-      <w:r>
-        <w:rPr>
-          <w:rFonts w:ascii="Courier New" w:hAnsi="Courier New"/>
-          <w:sz w:val="17"/>
-        </w:rPr>
-        <w:t>6. Portfolio README/release polish.</w:t>
-      </w:r>
-      <w:r>
-        <w:br/>
-      </w:r>
-      <w:r>
-        <w:rPr>
-          <w:rFonts w:ascii="Courier New" w:hAnsi="Courier New"/>
-          <w:sz w:val="17"/>
-        </w:rPr>
-      </w:r>
-      <w:r>
-        <w:br/>
-      </w:r>
-      <w:r>
-        <w:rPr>
-          <w:rFonts w:ascii="Courier New" w:hAnsi="Courier New"/>
-          <w:sz w:val="17"/>
-        </w:rPr>
-        <w:t>When giving Codex prompts, provide one focused feature at a time and include git commit messages.</w:t>
+        <w:t>When giving Codex prompts, provide one focused task at a time and include git commit messages.</w:t>
       </w:r>
     </w:p>
     <w:p>
@@ -1934,13 +1525,7 @@
         <w:pStyle w:val="ListBullet"/>
       </w:pPr>
       <w:r>
-        <w:rPr>
-          <w:b/>
-        </w:rPr>
-        <w:t xml:space="preserve">[ ] </w:t>
-      </w:r>
-      <w:r>
-        <w:t>Game loads with no console errors.</w:t>
+        <w:t>[ ] Game loads with no console errors, including the level validator pass for all 10 levels.</w:t>
       </w:r>
     </w:p>
     <w:p>
@@ -1976,13 +1561,7 @@
         <w:pStyle w:val="ListBullet"/>
       </w:pPr>
       <w:r>
-        <w:rPr>
-          <w:b/>
-        </w:rPr>
-        <w:t xml:space="preserve">[ ] </w:t>
-      </w:r>
-      <w:r>
-        <w:t>Shark chomp, jaw/nose motion, tail motion, and direction facing look correct.</w:t>
+        <w:t>[ ] Chunky shark chomp, angry eye, Frenzy appearance, tail motion, and direction facing look correct.</w:t>
       </w:r>
     </w:p>
     <w:p>
@@ -1990,13 +1569,7 @@
         <w:pStyle w:val="ListBullet"/>
       </w:pPr>
       <w:r>
-        <w:rPr>
-          <w:b/>
-        </w:rPr>
-        <w:t xml:space="preserve">[ ] </w:t>
-      </w:r>
-      <w:r>
-        <w:t>Dolphin, eel, and drone visuals remain readable during normal and Frenzy states.</w:t>
+        <w:t>[ ] Dolphin, eel, drone, and Puffer Guard visuals remain readable during normal and Frenzy states.</w:t>
       </w:r>
     </w:p>
     <w:p>
@@ -2110,13 +1683,7 @@
         <w:pStyle w:val="ListBullet"/>
       </w:pPr>
       <w:r>
-        <w:rPr>
-          <w:b/>
-        </w:rPr>
-        <w:t xml:space="preserve">[ ] </w:t>
-      </w:r>
-      <w:r>
-        <w:t>Performance stays smooth with bubbles, particles, creature animation, and audio.</w:t>
+        <w:t>[ ] Performance stays smooth with bubbles, particles, creature animation, audio, and later-level enemy counts.</w:t>
       </w:r>
     </w:p>
     <w:sectPr>

</xml_diff>

<commit_message>
finished levels 11 through 20
</commit_message>
<xml_diff>
--- a/Documents/Chomp_TODO_Roadmap_Updated.docx
+++ b/Documents/Chomp_TODO_Roadmap_Updated.docx
@@ -32,7 +32,7 @@
       <w:r>
         <w:t>Project: Chomp - A Shark Maze Arcade Game</w:t>
         <w:br/>
-        <w:t>Current build status: Playable browser-based HTML Canvas game with Golden Fish, Puffer Guard, 10 configured levels, responsive layout, visual polish, audio, and a completed source-level balance pass for Levels 4-10. Remaining work is final hands-on browser/mobile QA and release polish.</w:t>
+        <w:t>Current build status: Playable browser-based HTML Canvas game with Golden Fish, Puffer Guard, 20 configured levels, responsive layout, visual polish, audio, and a completed source-level validation pass for all configured levels. Levels 11-20 add the next expansion batch while preserving the existing v1 systems.</w:t>
       </w:r>
     </w:p>
     <w:p>
@@ -261,11 +261,8 @@
             <w:vAlign w:val="top"/>
           </w:tcPr>
           <w:p>
-            <w:pPr>
-              <w:spacing w:after="0"/>
-            </w:pPr>
             <w:r>
-              <w:t>Ten playable maze layouts with progression, difficulty scaling, debug mode, validation, and recent Levels 4-10 balance pass.</w:t>
+              <w:t>Twenty playable maze layouts with progression, difficulty scaling, debug mode, validation, and recent Levels 11-20 expansion pass.</w:t>
             </w:r>
           </w:p>
         </w:tc>
@@ -447,11 +444,8 @@
             <w:vAlign w:val="top"/>
           </w:tcPr>
           <w:p>
-            <w:pPr>
-              <w:spacing w:after="0"/>
-            </w:pPr>
             <w:r>
-              <w:t>Mostly complete for v1</w:t>
+              <w:t>Complete through Level 20</w:t>
             </w:r>
           </w:p>
         </w:tc>
@@ -461,11 +455,8 @@
             <w:vAlign w:val="top"/>
           </w:tcPr>
           <w:p>
-            <w:pPr>
-              <w:spacing w:after="0"/>
-            </w:pPr>
             <w:r>
-              <w:t>Golden Fish, Puffer Guard, and 10 levels are implemented. Remaining work: manual browser/mobile QA, screenshots, portfolio README, and release tag.</w:t>
+              <w:t>Golden Fish, Puffer Guard, and 20 levels are implemented. Remaining work: manual browser/mobile QA, screenshots, portfolio README, release tag, and eventual Levels 21-50 planning.</w:t>
             </w:r>
           </w:p>
         </w:tc>
@@ -838,7 +829,7 @@
         <w:pStyle w:val="ListBullet"/>
       </w:pPr>
       <w:r>
-        <w:t>[x] Added screen overlay polish, Frenzy Mode readability/balance polish, Golden Fish, Puffer Guard, and 10-level progression.</w:t>
+        <w:t>[x] Added screen overlay polish, Frenzy Mode readability/balance polish, Golden Fish, Puffer Guard, and 20-level progression.</w:t>
       </w:r>
     </w:p>
     <w:p>
@@ -940,7 +931,7 @@
         <w:pStyle w:val="ListBullet"/>
       </w:pPr>
       <w:r>
-        <w:t>[x] Make a source-level readability and balance pass: shark/enemy clarity, Frenzy clarity, particle density, HUD scaling, and Levels 4-10 pressure.</w:t>
+        <w:t>[x] Make source-level readability and balance passes: shark/enemy clarity, Frenzy clarity, particle density, HUD scaling, Levels 4-10 pressure, and Levels 11-20 expansion structure.</w:t>
       </w:r>
     </w:p>
     <w:p>
@@ -1304,7 +1295,7 @@
         <w:br/>
         <w:t>Current implemented features:</w:t>
         <w:br/>
-        <w:t>- HTML/CSS/JavaScript Canvas project suitable for GitHub Pages.</w:t>
+        <w:t>- HTML/CSS/JavaScript Canvas project published through GitHub Pages.</w:t>
         <w:br/>
         <w:t>- Tile-based maze system with coral reef walls, water paths, chum, Frenzy Bait, and Golden Fish.</w:t>
         <w:br/>
@@ -1316,13 +1307,13 @@
         <w:br/>
         <w:t>- Frenzy Mode: triggered by Frenzy Bait, makes enemies vulnerable, shark can chomp enemies for bonus points, timer/display/visual effects.</w:t>
         <w:br/>
-        <w:t>- Level clear/progression with 10 configured maze layouts and win condition after Level 10.</w:t>
+        <w:t>- Level clear/progression with 20 configured maze layouts and final victory after Level 20.</w:t>
         <w:br/>
         <w:t>- Visual polish: underwater page/HUD, reef maze styling, chunky shark art/chomp, creature motion polish, bubbles/particles, random shark-pun level-clear messages.</w:t>
         <w:br/>
         <w:t>- Audio polish: generated arcade sound effects using Web Audio API, mute saved with localStorage, subtle reverb/echo.</w:t>
         <w:br/>
-        <w:t>- Latest balance pass: Levels 4-10 inspected for reachability, spawn validity, Puffer route blocking, escape routes, enemy pressure, and difficulty progression. Levels 8-10 had enemy speed modifiers reduced so challenge comes from roster density and maze decisions rather than overcrowding at max speed.</w:t>
+        <w:t>- Latest expansion pass: Levels 11-20 were added with a deliberate second-batch difficulty curve. Puffers remain selective, Levels 18-20 are the main balancing risk area, and all configured levels pass the existing validator.</w:t>
         <w:br/>
         <w:br/>
         <w:t>Do not break existing gameplay. Keep code beginner-friendly, Canvas-only, no external libraries, preserve mobile support, GitHub Pages compatibility, debug mode, audio mute, high score, Golden Fish, Puffer Guard, level progression, and LICENSE. Do not redesign the approved chunky shark unless explicitly requested.</w:t>
@@ -1330,15 +1321,17 @@
         <w:br/>
         <w:t>Next likely roadmap phases:</w:t>
         <w:br/>
-        <w:t>1. Run full manual browser playtesting on desktop for Levels 1-10, with extra attention to Levels 4-10 and the Level 10 win flow.</w:t>
+        <w:t>1. Run full manual browser playtesting on desktop for Levels 11-20, with extra attention to Levels 18-20 and the Level 20 victory flow.</w:t>
         <w:br/>
-        <w:t>2. Run mobile/iPhone Safari testing from the GitHub Pages link: tap start/restart, swipe movement, pause, mute, audio unlock, scaling, and no unwanted scrolling.</w:t>
+        <w:t>2. Run mobile/iPhone Safari testing from the GitHub Pages link for the expanded level set: tap start/restart, swipe movement, pause, mute, audio unlock, scaling, and no unwanted scrolling.</w:t>
         <w:br/>
-        <w:t>3. Capture final screenshots or GIFs if desired for portfolio presentation.</w:t>
+        <w:t>3. Tune Levels 18-20 only if live testing shows speed, enemy density, or Puffer placement is unfair.</w:t>
         <w:br/>
-        <w:t>4. Finalize README/release polish and tag a stable v1.0 milestone when ready.</w:t>
+        <w:t>4. Capture final screenshots or GIFs if desired for portfolio presentation.</w:t>
         <w:br/>
-        <w:t>5. Later, consider post-v1 expansion toward additional levels only after the 10-level build is fully validated.</w:t>
+        <w:t>5. Finalize README/release polish and tag a stable milestone when ready.</w:t>
+        <w:br/>
+        <w:t>6. Later, consider post-v1 expansion toward Levels 21-50 only after the 20-level build is fully validated.</w:t>
         <w:br/>
         <w:br/>
         <w:t>When giving Codex prompts, provide one focused task at a time and include git commit messages.</w:t>
@@ -1686,6 +1679,39 @@
         <w:t>[ ] Performance stays smooth with bubbles, particles, creature animation, audio, and later-level enemy counts.</w:t>
       </w:r>
     </w:p>
+    <w:p>
+      <w:pPr>
+        <w:pStyle w:val="Heading2"/>
+      </w:pPr>
+      <w:r>
+        <w:t>Phase G - Levels 11-20 Expansion</w:t>
+      </w:r>
+    </w:p>
+    <w:p>
+      <w:r>
+        <w:t>[x] Add Levels 11-20 using the existing level-data format.</w:t>
+      </w:r>
+    </w:p>
+    <w:p>
+      <w:r>
+        <w:t>[x] Preserve Levels 1-10 and all existing systems.</w:t>
+      </w:r>
+    </w:p>
+    <w:p>
+      <w:r>
+        <w:t>[x] Keep Golden Fish available and document custom later-level timing.</w:t>
+      </w:r>
+    </w:p>
+    <w:p>
+      <w:r>
+        <w:t>[x] Validate all 20 configured levels with reachable collectibles and valid spawns.</w:t>
+      </w:r>
+    </w:p>
+    <w:p>
+      <w:r>
+        <w:t>[ ] Complete live browser/mobile playtesting for Levels 11-20, especially Levels 18-20.</w:t>
+      </w:r>
+    </w:p>
     <w:sectPr>
       <w:pgSz w:w="12240" w:h="15840"/>
       <w:pgMar w:top="864" w:right="936" w:bottom="864" w:left="936" w:header="720" w:footer="720" w:gutter="0"/>

</xml_diff>